<commit_message>
Auto sync 2026-09-10 10:29:04
</commit_message>
<xml_diff>
--- a/脱骨侠发货单H5/订单履约时效管理PRD_V1.0_20260910.docx
+++ b/脱骨侠发货单H5/订单履约时效管理PRD_V1.0_20260910.docx
@@ -697,11 +697,6 @@
     <w:p>
       <w:r>
         <w:t>文中的“已确认”指业务已明确的流程与页面要求；“原型现状”描述当前前端能力；“建议”及第12章的待确认项需评审后定版。当前页面可操作不代表已接入真实订单、ERP、WMS或消息服务。</w:t>
-      </w:r>
-    </w:p>
-    <w:p>
-      <w:r>
-        <w:br w:type="page"/>
       </w:r>
     </w:p>
     <w:p>
@@ -1639,11 +1634,6 @@
       </w:r>
     </w:p>
     <w:p>
-      <w:r>
-        <w:br w:type="page"/>
-      </w:r>
-    </w:p>
-    <w:p>
       <w:pPr>
         <w:pStyle w:val="Heading1"/>
       </w:pPr>
@@ -2288,11 +2278,6 @@
     <w:p>
       <w:r>
         <w:t>商品发货时效是否从下单起算，以及它与“同步旺店通成功后到ERP同步WMS并生成单号”的发货节点时限是覆盖关系还是两个独立约束，必须先确定。多商品订单按最长、最短还是逐商品判断，也须明确。以上均列入D01，不应由研发自行假定。</w:t>
-      </w:r>
-    </w:p>
-    <w:p>
-      <w:r>
-        <w:br w:type="page"/>
       </w:r>
     </w:p>
     <w:p>
@@ -3192,11 +3177,6 @@
       </w:r>
     </w:p>
     <w:p>
-      <w:r>
-        <w:br w:type="page"/>
-      </w:r>
-    </w:p>
-    <w:p>
       <w:pPr>
         <w:pStyle w:val="Heading1"/>
       </w:pPr>
@@ -4076,11 +4056,6 @@
       </w:r>
     </w:p>
     <w:p>
-      <w:r>
-        <w:br w:type="page"/>
-      </w:r>
-    </w:p>
-    <w:p>
       <w:pPr>
         <w:pStyle w:val="Heading1"/>
       </w:pPr>
@@ -4791,11 +4766,6 @@
       </w:r>
     </w:p>
     <w:p>
-      <w:r>
-        <w:br w:type="page"/>
-      </w:r>
-    </w:p>
-    <w:p>
       <w:pPr>
         <w:pStyle w:val="Heading1"/>
       </w:pPr>
@@ -5362,11 +5332,6 @@
     <w:p>
       <w:r>
         <w:t>普通订单显示固定节点时效；系统客户前五个节点注明按客户要求到货时间倒排，回执注明签收后按客户规则计时。红色表示超时，橙色表示预警，绿色表示正常，灰色表示待判定、待同步或关闭；状态同时有文字，不能只靠颜色区分。</w:t>
-      </w:r>
-    </w:p>
-    <w:p>
-      <w:r>
-        <w:br w:type="page"/>
       </w:r>
     </w:p>
     <w:p>
@@ -6006,11 +5971,6 @@
     <w:p>
       <w:r>
         <w:t>列表优先超时、预警、待判定，再正常。相同时效状态下，系统客户按实际节点截止时间排序，不用通用小时数替代；普通客户按超时或剩余程度排序。数据不完整的订单不得被合并进“正常履约”以掩盖未知待办。</w:t>
-      </w:r>
-    </w:p>
-    <w:p>
-      <w:r>
-        <w:br w:type="page"/>
       </w:r>
     </w:p>
     <w:p>
@@ -6872,11 +6832,6 @@
     <w:p>
       <w:r>
         <w:t>当前原型只保存本机单份草稿，不创建真实订单。正式对接时，应区分保存草稿与提交订单，并在提交成功后取得真实订单ID，才能进入履约任务和总览统计。提交失败须保留输入并允许重试；重复点击不得生成重复订单。</w:t>
-      </w:r>
-    </w:p>
-    <w:p>
-      <w:r>
-        <w:br w:type="page"/>
       </w:r>
     </w:p>
     <w:p>
@@ -7759,11 +7714,6 @@
       </w:r>
     </w:p>
     <w:p>
-      <w:r>
-        <w:br w:type="page"/>
-      </w:r>
-    </w:p>
-    <w:p>
       <w:pPr>
         <w:pStyle w:val="Heading1"/>
       </w:pPr>
@@ -8463,11 +8413,6 @@
       </w:r>
     </w:p>
     <w:p>
-      <w:r>
-        <w:br w:type="page"/>
-      </w:r>
-    </w:p>
-    <w:p>
       <w:pPr>
         <w:pStyle w:val="Heading1"/>
       </w:pPr>
@@ -8587,11 +8532,6 @@
     <w:p>
       <w:r>
         <w:t>以上事项应由业务负责人牵头，结合财务、工厂、仓储、客服及研发完成评审。文档不代填审批结论或负责人姓名；未定版的关键口径不应进入生产验收。</w:t>
-      </w:r>
-    </w:p>
-    <w:p>
-      <w:r>
-        <w:br w:type="page"/>
       </w:r>
     </w:p>
     <w:p>
@@ -10648,11 +10588,6 @@
       </w:r>
     </w:p>
     <w:p>
-      <w:r>
-        <w:br w:type="page"/>
-      </w:r>
-    </w:p>
-    <w:p>
       <w:pPr>
         <w:pStyle w:val="Heading1"/>
       </w:pPr>

</xml_diff>